<commit_message>
Updated Final Report for ECE528
</commit_message>
<xml_diff>
--- a/ECE528_Final_Project_Report.docx
+++ b/ECE528_Final_Project_Report.docx
@@ -77,7 +77,7 @@
           <w:szCs w:val="52"/>
         </w:rPr>
         <w:drawing>
-          <wp:inline distT="0" distB="0" distL="0" distR="0" wp14:anchorId="6A185153" wp14:editId="19C72E89">
+          <wp:inline distT="0" distB="0" distL="0" distR="0" wp14:anchorId="6A185153" wp14:editId="307A54A9">
             <wp:extent cx="2353945" cy="2319655"/>
             <wp:effectExtent l="0" t="0" r="0" b="0"/>
             <wp:docPr id="972154022" name="Picture 3" descr="California State University, Northridge - Wikipedia"/>
@@ -249,16 +249,8 @@
         <w:rPr>
           <w:rFonts w:ascii="Times New Roman" w:hAnsi="Times New Roman" w:cs="Times New Roman"/>
         </w:rPr>
-        <w:t xml:space="preserve">Performed By: Antonio Anzora Jr &amp; Vartan </w:t>
-      </w:r>
-      <w:proofErr w:type="spellStart"/>
-      <w:r>
-        <w:rPr>
-          <w:rFonts w:ascii="Times New Roman" w:hAnsi="Times New Roman" w:cs="Times New Roman"/>
-        </w:rPr>
-        <w:t>Chakryan</w:t>
-      </w:r>
-      <w:proofErr w:type="spellEnd"/>
+        <w:t>Performed By: Antonio Anzora Jr &amp; Vartan Chakryan</w:t>
+      </w:r>
     </w:p>
     <w:p>
       <w:pPr>
@@ -798,19 +790,11 @@
                 <w:rFonts w:ascii="Times New Roman" w:hAnsi="Times New Roman" w:cs="Times New Roman"/>
               </w:rPr>
             </w:pPr>
-            <w:proofErr w:type="spellStart"/>
-            <w:r>
-              <w:rPr>
-                <w:rFonts w:ascii="Times New Roman" w:hAnsi="Times New Roman" w:cs="Times New Roman"/>
-              </w:rPr>
-              <w:t>Tenergy</w:t>
-            </w:r>
-            <w:proofErr w:type="spellEnd"/>
-            <w:r>
-              <w:rPr>
-                <w:rFonts w:ascii="Times New Roman" w:hAnsi="Times New Roman" w:cs="Times New Roman"/>
-              </w:rPr>
-              <w:t xml:space="preserve"> 7.4V Battery Charger</w:t>
+            <w:r>
+              <w:rPr>
+                <w:rFonts w:ascii="Times New Roman" w:hAnsi="Times New Roman" w:cs="Times New Roman"/>
+              </w:rPr>
+              <w:t>Tenergy 7.4V Battery Charger</w:t>
             </w:r>
           </w:p>
         </w:tc>
@@ -933,19 +917,11 @@
                 <w:rFonts w:ascii="Times New Roman" w:hAnsi="Times New Roman" w:cs="Times New Roman"/>
               </w:rPr>
             </w:pPr>
-            <w:proofErr w:type="spellStart"/>
-            <w:r>
-              <w:rPr>
-                <w:rFonts w:ascii="Times New Roman" w:hAnsi="Times New Roman" w:cs="Times New Roman"/>
-              </w:rPr>
-              <w:t>VSCode</w:t>
-            </w:r>
-            <w:proofErr w:type="spellEnd"/>
-            <w:r>
-              <w:rPr>
-                <w:rFonts w:ascii="Times New Roman" w:hAnsi="Times New Roman" w:cs="Times New Roman"/>
-              </w:rPr>
-              <w:t xml:space="preserve"> + Platform IO Extension</w:t>
+            <w:r>
+              <w:rPr>
+                <w:rFonts w:ascii="Times New Roman" w:hAnsi="Times New Roman" w:cs="Times New Roman"/>
+              </w:rPr>
+              <w:t>VSCode + Platform IO Extension</w:t>
             </w:r>
           </w:p>
         </w:tc>
@@ -1160,25 +1136,7 @@
           <w:b/>
           <w:bCs/>
         </w:rPr>
-        <w:t>i-Fi (</w:t>
-      </w:r>
-      <w:proofErr w:type="spellStart"/>
-      <w:r>
-        <w:rPr>
-          <w:rFonts w:ascii="Times New Roman" w:hAnsi="Times New Roman" w:cs="Times New Roman"/>
-          <w:b/>
-          <w:bCs/>
-        </w:rPr>
-        <w:t>SoftAP</w:t>
-      </w:r>
-      <w:proofErr w:type="spellEnd"/>
-      <w:r>
-        <w:rPr>
-          <w:rFonts w:ascii="Times New Roman" w:hAnsi="Times New Roman" w:cs="Times New Roman"/>
-          <w:b/>
-          <w:bCs/>
-        </w:rPr>
-        <w:t xml:space="preserve"> Mode):</w:t>
+        <w:t>i-Fi (SoftAP Mode):</w:t>
       </w:r>
     </w:p>
     <w:p>
@@ -1364,23 +1322,13 @@
           <w:bCs/>
         </w:rPr>
       </w:pPr>
-      <w:proofErr w:type="spellStart"/>
-      <w:r>
-        <w:rPr>
-          <w:rFonts w:ascii="Times New Roman" w:hAnsi="Times New Roman" w:cs="Times New Roman"/>
-          <w:b/>
-          <w:bCs/>
-        </w:rPr>
-        <w:t>WebServer</w:t>
-      </w:r>
-      <w:proofErr w:type="spellEnd"/>
-      <w:r>
-        <w:rPr>
-          <w:rFonts w:ascii="Times New Roman" w:hAnsi="Times New Roman" w:cs="Times New Roman"/>
-          <w:b/>
-          <w:bCs/>
-        </w:rPr>
-        <w:t xml:space="preserve"> Library (HTTP Server):</w:t>
+      <w:r>
+        <w:rPr>
+          <w:rFonts w:ascii="Times New Roman" w:hAnsi="Times New Roman" w:cs="Times New Roman"/>
+          <w:b/>
+          <w:bCs/>
+        </w:rPr>
+        <w:t>WebServer Library (HTTP Server):</w:t>
       </w:r>
     </w:p>
     <w:p>
@@ -2417,34 +2365,14 @@
     </w:p>
     <w:p>
       <w:pPr>
-        <w:rPr>
-          <w:rFonts w:ascii="Times New Roman" w:hAnsi="Times New Roman" w:cs="Times New Roman"/>
-        </w:rPr>
-      </w:pPr>
-      <w:r>
-        <w:rPr>
-          <w:rFonts w:ascii="Times New Roman" w:hAnsi="Times New Roman" w:cs="Times New Roman"/>
-        </w:rPr>
-        <w:tab/>
-      </w:r>
-      <w:r>
-        <w:rPr>
-          <w:rFonts w:ascii="Times New Roman" w:hAnsi="Times New Roman" w:cs="Times New Roman"/>
-        </w:rPr>
-        <w:t>We were able to create a Web Interface that allowed real-time control of the robot through the ESP32’s Wi-Fi. The robot responded correctly to all movement commands (forward, backward, left, right, and stop) and operated well during testing. One limitation observed was the wheel performance. The wheels produced noticeable noise and resistance, especially during left and right turns. Upgrading to higher-quality wheels or using a different traction material would improve movement smoothness and efficiency. Despite this, the robot performed functions effectively and provided the user with an enjoyable experience, especially when using a touchscreen device, which made the controls feel more natural and responsive.</w:t>
-      </w:r>
-    </w:p>
-    <w:p>
-      <w:pPr>
-        <w:rPr>
-          <w:rFonts w:ascii="Times New Roman" w:hAnsi="Times New Roman" w:cs="Times New Roman"/>
-        </w:rPr>
-      </w:pPr>
-      <w:r>
-        <w:rPr>
-          <w:rFonts w:ascii="Times New Roman" w:hAnsi="Times New Roman" w:cs="Times New Roman"/>
-        </w:rPr>
-        <w:tab/>
+        <w:spacing w:before="240" w:after="240"/>
+        <w:ind w:firstLine="720"/>
+      </w:pPr>
+      <w:r>
+        <w:rPr>
+          <w:rFonts w:ascii="Times New Roman" w:eastAsia="Times New Roman" w:hAnsi="Times New Roman" w:cs="Times New Roman"/>
+        </w:rPr>
+        <w:t>We were able to create a Web Interface that allowed real-time control of the robot through the ESP32’s Wi-Fi. The robot responded correctly to all movement commands (forward, backward, left, right, and stop) and operated well during testing. One limitation observed was the wheel performance. The wheels produced noticeable noise and resistance, especially during left and right turns. Upgrading to higher-quality wheels or using a different traction material would improve movement smoothness and efficiency. Despite this, the robot performed its functions effectively and provided the user with an enjoyable experience, especially when using a touchscreen device, which made the controls feel more natural and responsive. The web-based controller was built using HTML for the page layout and JavaScript for the interactive logic. When a button is pressed, JavaScript sends an HTTP request to the ESP32 using the fetch() API, and the ESP32 interprets this as a movement command and drives the motors accordingly. The interface visually updates the selected command by highlighting the active button and displaying the robot’s current state in real time. The ESP32-CAM’s live video stream was also embedded directly into the webpage by loading its MJPEG stream URL into an image element. While functional, the camera’s image quality and frame rate were notably low due to hardware limitations, and using a higher-quality camera module would significantly improve clarity and responsiveness. Overall, the combined web interface, camera feed, and wireless control produced a seamless remote-operation experience while highlighting areas that could be enhanced in future iterations.</w:t>
       </w:r>
     </w:p>
     <w:p>
@@ -2542,6 +2470,7 @@
         <w:rPr>
           <w:rFonts w:ascii="Times New Roman" w:hAnsi="Times New Roman" w:cs="Times New Roman"/>
         </w:rPr>
+        <w:lastRenderedPageBreak/>
         <w:t xml:space="preserve">Overall, </w:t>
       </w:r>
       <w:r>
@@ -2656,20 +2585,11 @@
           <w:rFonts w:ascii="Times New Roman" w:hAnsi="Times New Roman" w:cs="Times New Roman"/>
         </w:rPr>
       </w:pPr>
-      <w:proofErr w:type="spellStart"/>
-      <w:r>
-        <w:rPr>
-          <w:rFonts w:ascii="Times New Roman" w:hAnsi="Times New Roman" w:cs="Times New Roman"/>
-        </w:rPr>
-        <w:lastRenderedPageBreak/>
-        <w:t>Espressif</w:t>
-      </w:r>
-      <w:proofErr w:type="spellEnd"/>
-      <w:r>
-        <w:rPr>
-          <w:rFonts w:ascii="Times New Roman" w:hAnsi="Times New Roman" w:cs="Times New Roman"/>
-        </w:rPr>
-        <w:t xml:space="preserve"> Systems. </w:t>
+      <w:r>
+        <w:rPr>
+          <w:rFonts w:ascii="Times New Roman" w:hAnsi="Times New Roman" w:cs="Times New Roman"/>
+        </w:rPr>
+        <w:t xml:space="preserve">Espressif Systems. </w:t>
       </w:r>
       <w:r>
         <w:rPr>
@@ -2719,21 +2639,7 @@
         <w:rPr>
           <w:rFonts w:ascii="Times New Roman" w:hAnsi="Times New Roman" w:cs="Times New Roman"/>
         </w:rPr>
-        <w:t xml:space="preserve">. </w:t>
-      </w:r>
-      <w:proofErr w:type="spellStart"/>
-      <w:r>
-        <w:rPr>
-          <w:rFonts w:ascii="Times New Roman" w:hAnsi="Times New Roman" w:cs="Times New Roman"/>
-        </w:rPr>
-        <w:t>Espressif</w:t>
-      </w:r>
-      <w:proofErr w:type="spellEnd"/>
-      <w:r>
-        <w:rPr>
-          <w:rFonts w:ascii="Times New Roman" w:hAnsi="Times New Roman" w:cs="Times New Roman"/>
-        </w:rPr>
-        <w:t xml:space="preserve"> Systems, 2021, documentation.espressif.com/esp32-wroom-32e_esp32-wroom-32ue_datasheet_en.pdf. PDF download.</w:t>
+        <w:t>. Espressif Systems, 2021, documentation.espressif.com/esp32-wroom-32e_esp32-wroom-32ue_datasheet_en.pdf. PDF download.</w:t>
       </w:r>
     </w:p>
     <w:p>
@@ -2747,19 +2653,11 @@
           <w:rFonts w:ascii="Times New Roman" w:hAnsi="Times New Roman" w:cs="Times New Roman"/>
         </w:rPr>
       </w:pPr>
-      <w:proofErr w:type="spellStart"/>
-      <w:r>
-        <w:rPr>
-          <w:rFonts w:ascii="Times New Roman" w:hAnsi="Times New Roman" w:cs="Times New Roman"/>
-        </w:rPr>
-        <w:t>SparkFun</w:t>
-      </w:r>
-      <w:proofErr w:type="spellEnd"/>
-      <w:r>
-        <w:rPr>
-          <w:rFonts w:ascii="Times New Roman" w:hAnsi="Times New Roman" w:cs="Times New Roman"/>
-        </w:rPr>
-        <w:t xml:space="preserve">. </w:t>
+      <w:r>
+        <w:rPr>
+          <w:rFonts w:ascii="Times New Roman" w:hAnsi="Times New Roman" w:cs="Times New Roman"/>
+        </w:rPr>
+        <w:t xml:space="preserve">SparkFun. </w:t>
       </w:r>
       <w:r>
         <w:rPr>
@@ -2773,21 +2671,7 @@
         <w:rPr>
           <w:rFonts w:ascii="Times New Roman" w:hAnsi="Times New Roman" w:cs="Times New Roman"/>
         </w:rPr>
-        <w:t xml:space="preserve">. </w:t>
-      </w:r>
-      <w:proofErr w:type="spellStart"/>
-      <w:r>
-        <w:rPr>
-          <w:rFonts w:ascii="Times New Roman" w:hAnsi="Times New Roman" w:cs="Times New Roman"/>
-        </w:rPr>
-        <w:t>SparkFun</w:t>
-      </w:r>
-      <w:proofErr w:type="spellEnd"/>
-      <w:r>
-        <w:rPr>
-          <w:rFonts w:ascii="Times New Roman" w:hAnsi="Times New Roman" w:cs="Times New Roman"/>
-        </w:rPr>
-        <w:t xml:space="preserve"> Electronics, 2012, cdn.sparkfun.com/datasheets/Robotics/TB6612FNG.pdf. PDF download.</w:t>
+        <w:t>. SparkFun Electronics, 2012, cdn.sparkfun.com/datasheets/Robotics/TB6612FNG.pdf. PDF download.</w:t>
       </w:r>
     </w:p>
     <w:p>
@@ -2805,37 +2689,8 @@
         <w:rPr>
           <w:rFonts w:ascii="Times New Roman" w:hAnsi="Times New Roman" w:cs="Times New Roman"/>
         </w:rPr>
-        <w:t>“</w:t>
-      </w:r>
-      <w:proofErr w:type="spellStart"/>
-      <w:r>
-        <w:rPr>
-          <w:rFonts w:ascii="Times New Roman" w:hAnsi="Times New Roman" w:cs="Times New Roman"/>
-        </w:rPr>
-        <w:t>Instructables</w:t>
-      </w:r>
-      <w:proofErr w:type="spellEnd"/>
-      <w:r>
-        <w:rPr>
-          <w:rFonts w:ascii="Times New Roman" w:hAnsi="Times New Roman" w:cs="Times New Roman"/>
-        </w:rPr>
-        <w:t xml:space="preserve">.” “Driving Small Motors </w:t>
-      </w:r>
-      <w:proofErr w:type="gramStart"/>
-      <w:r>
-        <w:rPr>
-          <w:rFonts w:ascii="Times New Roman" w:hAnsi="Times New Roman" w:cs="Times New Roman"/>
-        </w:rPr>
-        <w:t>With</w:t>
-      </w:r>
-      <w:proofErr w:type="gramEnd"/>
-      <w:r>
-        <w:rPr>
-          <w:rFonts w:ascii="Times New Roman" w:hAnsi="Times New Roman" w:cs="Times New Roman"/>
-        </w:rPr>
-        <w:t xml:space="preserve"> the TB6612FNG.” </w:t>
-      </w:r>
-      <w:proofErr w:type="spellStart"/>
+        <w:t xml:space="preserve">“Instructables.” “Driving Small Motors With the TB6612FNG.” </w:t>
+      </w:r>
       <w:r>
         <w:rPr>
           <w:rFonts w:ascii="Times New Roman" w:hAnsi="Times New Roman" w:cs="Times New Roman"/>
@@ -2844,7 +2699,6 @@
         </w:rPr>
         <w:t>Instructables</w:t>
       </w:r>
-      <w:proofErr w:type="spellEnd"/>
       <w:r>
         <w:rPr>
           <w:rFonts w:ascii="Times New Roman" w:hAnsi="Times New Roman" w:cs="Times New Roman"/>
@@ -2953,21 +2807,7 @@
         <w:rPr>
           <w:rFonts w:ascii="Times New Roman" w:hAnsi="Times New Roman" w:cs="Times New Roman"/>
         </w:rPr>
-        <w:t>“</w:t>
-      </w:r>
-      <w:proofErr w:type="spellStart"/>
-      <w:r>
-        <w:rPr>
-          <w:rFonts w:ascii="Times New Roman" w:hAnsi="Times New Roman" w:cs="Times New Roman"/>
-        </w:rPr>
-        <w:t>PlatformIO</w:t>
-      </w:r>
-      <w:proofErr w:type="spellEnd"/>
-      <w:r>
-        <w:rPr>
-          <w:rFonts w:ascii="Times New Roman" w:hAnsi="Times New Roman" w:cs="Times New Roman"/>
-        </w:rPr>
-        <w:t xml:space="preserve"> Setup for ESP32 with ESP</w:t>
+        <w:t>“PlatformIO Setup for ESP32 with ESP</w:t>
       </w:r>
       <w:r>
         <w:rPr>
@@ -2976,23 +2816,13 @@
         <w:noBreakHyphen/>
         <w:t xml:space="preserve">IDF.” </w:t>
       </w:r>
-      <w:proofErr w:type="spellStart"/>
       <w:r>
         <w:rPr>
           <w:rFonts w:ascii="Times New Roman" w:hAnsi="Times New Roman" w:cs="Times New Roman"/>
           <w:i/>
           <w:iCs/>
         </w:rPr>
-        <w:t>Espressif</w:t>
-      </w:r>
-      <w:proofErr w:type="spellEnd"/>
-      <w:r>
-        <w:rPr>
-          <w:rFonts w:ascii="Times New Roman" w:hAnsi="Times New Roman" w:cs="Times New Roman"/>
-          <w:i/>
-          <w:iCs/>
-        </w:rPr>
-        <w:t xml:space="preserve"> Docs</w:t>
+        <w:t>Espressif Docs</w:t>
       </w:r>
       <w:r>
         <w:rPr>
@@ -3063,21 +2893,7 @@
         <w:rPr>
           <w:rFonts w:ascii="Times New Roman" w:hAnsi="Times New Roman" w:cs="Times New Roman"/>
         </w:rPr>
-        <w:t xml:space="preserve">“Getting Started with </w:t>
-      </w:r>
-      <w:proofErr w:type="spellStart"/>
-      <w:r>
-        <w:rPr>
-          <w:rFonts w:ascii="Times New Roman" w:hAnsi="Times New Roman" w:cs="Times New Roman"/>
-        </w:rPr>
-        <w:t>PlatformIO</w:t>
-      </w:r>
-      <w:proofErr w:type="spellEnd"/>
-      <w:r>
-        <w:rPr>
-          <w:rFonts w:ascii="Times New Roman" w:hAnsi="Times New Roman" w:cs="Times New Roman"/>
-        </w:rPr>
-        <w:t xml:space="preserve"> - YouTube.” </w:t>
+        <w:t xml:space="preserve">“Getting Started with PlatformIO - YouTube.” </w:t>
       </w:r>
       <w:r>
         <w:rPr>
@@ -3091,21 +2907,7 @@
         <w:rPr>
           <w:rFonts w:ascii="Times New Roman" w:hAnsi="Times New Roman" w:cs="Times New Roman"/>
         </w:rPr>
-        <w:t>, uploaded by user (</w:t>
-      </w:r>
-      <w:proofErr w:type="spellStart"/>
-      <w:r>
-        <w:rPr>
-          <w:rFonts w:ascii="Times New Roman" w:hAnsi="Times New Roman" w:cs="Times New Roman"/>
-        </w:rPr>
-        <w:t>DroneBot</w:t>
-      </w:r>
-      <w:proofErr w:type="spellEnd"/>
-      <w:r>
-        <w:rPr>
-          <w:rFonts w:ascii="Times New Roman" w:hAnsi="Times New Roman" w:cs="Times New Roman"/>
-        </w:rPr>
-        <w:t xml:space="preserve"> Workshop), - (Jam 16, 2021),</w:t>
+        <w:t>, uploaded by user (DroneBot Workshop), - (Jam 16, 2021),</w:t>
       </w:r>
       <w:hyperlink r:id="rId14" w:history="1">
         <w:r>
@@ -4438,6 +4240,7 @@
   <w:style w:type="character" w:default="1" w:styleId="DefaultParagraphFont">
     <w:name w:val="Default Paragraph Font"/>
     <w:uiPriority w:val="1"/>
+    <w:semiHidden/>
     <w:unhideWhenUsed/>
   </w:style>
   <w:style w:type="table" w:default="1" w:styleId="TableNormal">

</xml_diff>